<commit_message>
Update Lab 2 report with PDF
</commit_message>
<xml_diff>
--- a/Lab-2/Lab_2_Day 1 & Day 2.docx
+++ b/Lab-2/Lab_2_Day 1 & Day 2.docx
@@ -1480,6 +1480,7 @@
       <w:r>
         <w:rPr>
           <w:rFonts w:ascii="Times New Roman" w:hAnsi="Times New Roman" w:cs="Times New Roman"/>
+          <w:noProof/>
         </w:rPr>
         <w:drawing>
           <wp:inline distT="0" distB="0" distL="0" distR="0" wp14:anchorId="3A59663F" wp14:editId="78C08281">
@@ -1517,6 +1518,283 @@
           </wp:inline>
         </w:drawing>
       </w:r>
+    </w:p>
+    <w:p>
+      <w:pPr>
+        <w:jc w:val="center"/>
+        <w:rPr>
+          <w:rFonts w:ascii="Times New Roman" w:hAnsi="Times New Roman" w:cs="Times New Roman"/>
+        </w:rPr>
+      </w:pPr>
+    </w:p>
+    <w:p>
+      <w:pPr>
+        <w:jc w:val="center"/>
+        <w:rPr>
+          <w:rFonts w:ascii="Times New Roman" w:hAnsi="Times New Roman" w:cs="Times New Roman"/>
+        </w:rPr>
+      </w:pPr>
+    </w:p>
+    <w:p>
+      <w:pPr>
+        <w:jc w:val="center"/>
+        <w:rPr>
+          <w:rFonts w:ascii="Times New Roman" w:hAnsi="Times New Roman" w:cs="Times New Roman"/>
+        </w:rPr>
+      </w:pPr>
+    </w:p>
+    <w:p>
+      <w:pPr>
+        <w:rPr>
+          <w:rFonts w:ascii="Times New Roman" w:hAnsi="Times New Roman" w:cs="Times New Roman"/>
+          <w:lang w:val="en-IN"/>
+        </w:rPr>
+      </w:pPr>
+      <w:r>
+        <w:rPr>
+          <w:rFonts w:ascii="Times New Roman" w:hAnsi="Times New Roman" w:cs="Times New Roman"/>
+          <w:lang w:val="en-IN"/>
+        </w:rPr>
+        <w:lastRenderedPageBreak/>
+        <w:t>T</w:t>
+      </w:r>
+      <w:r>
+        <w:rPr>
+          <w:rFonts w:ascii="Times New Roman" w:hAnsi="Times New Roman" w:cs="Times New Roman"/>
+          <w:lang w:val="en-IN"/>
+        </w:rPr>
+        <w:t xml:space="preserve">his screenshot shows the Jira </w:t>
+      </w:r>
+      <w:r>
+        <w:rPr>
+          <w:rFonts w:ascii="Times New Roman" w:hAnsi="Times New Roman" w:cs="Times New Roman"/>
+          <w:b/>
+          <w:bCs/>
+          <w:lang w:val="en-IN"/>
+        </w:rPr>
+        <w:t>Active Sprint</w:t>
+      </w:r>
+      <w:r>
+        <w:rPr>
+          <w:rFonts w:ascii="Times New Roman" w:hAnsi="Times New Roman" w:cs="Times New Roman"/>
+          <w:lang w:val="en-IN"/>
+        </w:rPr>
+        <w:t xml:space="preserve"> board for the Household Carbon Footprint &amp; Target Tracker project. At this stage, four user stories have been completed and are displayed in the </w:t>
+      </w:r>
+      <w:r>
+        <w:rPr>
+          <w:rFonts w:ascii="Times New Roman" w:hAnsi="Times New Roman" w:cs="Times New Roman"/>
+          <w:b/>
+          <w:bCs/>
+          <w:lang w:val="en-IN"/>
+        </w:rPr>
+        <w:t>Done</w:t>
+      </w:r>
+      <w:r>
+        <w:rPr>
+          <w:rFonts w:ascii="Times New Roman" w:hAnsi="Times New Roman" w:cs="Times New Roman"/>
+          <w:lang w:val="en-IN"/>
+        </w:rPr>
+        <w:t xml:space="preserve"> column: </w:t>
+      </w:r>
+      <w:r>
+        <w:rPr>
+          <w:rFonts w:ascii="Times New Roman" w:hAnsi="Times New Roman" w:cs="Times New Roman"/>
+          <w:b/>
+          <w:bCs/>
+          <w:lang w:val="en-IN"/>
+        </w:rPr>
+        <w:t xml:space="preserve">HCFTT-5 Calculate Monthly </w:t>
+      </w:r>
+      <w:proofErr w:type="spellStart"/>
+      <w:r>
+        <w:rPr>
+          <w:rFonts w:ascii="Times New Roman" w:hAnsi="Times New Roman" w:cs="Times New Roman"/>
+          <w:b/>
+          <w:bCs/>
+          <w:lang w:val="en-IN"/>
+        </w:rPr>
+        <w:t>CO₂e</w:t>
+      </w:r>
+      <w:proofErr w:type="spellEnd"/>
+      <w:r>
+        <w:rPr>
+          <w:rFonts w:ascii="Times New Roman" w:hAnsi="Times New Roman" w:cs="Times New Roman"/>
+          <w:b/>
+          <w:bCs/>
+          <w:lang w:val="en-IN"/>
+        </w:rPr>
+        <w:t>, HCFTT-4 Record Monthly Consumption, HCFTT-7 Set Reduction Target, and HCFTT-6 View Emissions History</w:t>
+      </w:r>
+      <w:r>
+        <w:rPr>
+          <w:rFonts w:ascii="Times New Roman" w:hAnsi="Times New Roman" w:cs="Times New Roman"/>
+          <w:lang w:val="en-IN"/>
+        </w:rPr>
+        <w:t>.</w:t>
+      </w:r>
+    </w:p>
+    <w:p>
+      <w:pPr>
+        <w:rPr>
+          <w:rFonts w:ascii="Times New Roman" w:hAnsi="Times New Roman" w:cs="Times New Roman"/>
+        </w:rPr>
+      </w:pPr>
+      <w:r>
+        <w:rPr>
+          <w:rFonts w:ascii="Times New Roman" w:hAnsi="Times New Roman" w:cs="Times New Roman"/>
+          <w:lang w:val="en-IN"/>
+        </w:rPr>
+        <w:t xml:space="preserve">Two user stories remain in the </w:t>
+      </w:r>
+      <w:r>
+        <w:rPr>
+          <w:rFonts w:ascii="Times New Roman" w:hAnsi="Times New Roman" w:cs="Times New Roman"/>
+          <w:b/>
+          <w:bCs/>
+          <w:lang w:val="en-IN"/>
+        </w:rPr>
+        <w:t>In Progress</w:t>
+      </w:r>
+      <w:r>
+        <w:rPr>
+          <w:rFonts w:ascii="Times New Roman" w:hAnsi="Times New Roman" w:cs="Times New Roman"/>
+          <w:lang w:val="en-IN"/>
+        </w:rPr>
+        <w:t xml:space="preserve"> column: </w:t>
+      </w:r>
+      <w:r>
+        <w:rPr>
+          <w:rFonts w:ascii="Times New Roman" w:hAnsi="Times New Roman" w:cs="Times New Roman"/>
+          <w:b/>
+          <w:bCs/>
+          <w:lang w:val="en-IN"/>
+        </w:rPr>
+        <w:t>HCFTT-9 Review Household Progress</w:t>
+      </w:r>
+      <w:r>
+        <w:rPr>
+          <w:rFonts w:ascii="Times New Roman" w:hAnsi="Times New Roman" w:cs="Times New Roman"/>
+          <w:lang w:val="en-IN"/>
+        </w:rPr>
+        <w:t xml:space="preserve"> and </w:t>
+      </w:r>
+      <w:r>
+        <w:rPr>
+          <w:rFonts w:ascii="Times New Roman" w:hAnsi="Times New Roman" w:cs="Times New Roman"/>
+          <w:b/>
+          <w:bCs/>
+          <w:lang w:val="en-IN"/>
+        </w:rPr>
+        <w:t>HCFTT-8 Track Target Progress</w:t>
+      </w:r>
+      <w:r>
+        <w:rPr>
+          <w:rFonts w:ascii="Times New Roman" w:hAnsi="Times New Roman" w:cs="Times New Roman"/>
+          <w:lang w:val="en-IN"/>
+        </w:rPr>
+        <w:t xml:space="preserve">. The </w:t>
+      </w:r>
+      <w:r>
+        <w:rPr>
+          <w:rFonts w:ascii="Times New Roman" w:hAnsi="Times New Roman" w:cs="Times New Roman"/>
+          <w:b/>
+          <w:bCs/>
+          <w:lang w:val="en-IN"/>
+        </w:rPr>
+        <w:t>To Do</w:t>
+      </w:r>
+      <w:r>
+        <w:rPr>
+          <w:rFonts w:ascii="Times New Roman" w:hAnsi="Times New Roman" w:cs="Times New Roman"/>
+          <w:lang w:val="en-IN"/>
+        </w:rPr>
+        <w:t xml:space="preserve"> column is empty, indicating that all currently included work items have been started or completed</w:t>
+      </w:r>
+    </w:p>
+    <w:p>
+      <w:pPr>
+        <w:jc w:val="center"/>
+        <w:rPr>
+          <w:rFonts w:ascii="Times New Roman" w:hAnsi="Times New Roman" w:cs="Times New Roman"/>
+        </w:rPr>
+      </w:pPr>
+      <w:r>
+        <w:rPr>
+          <w:noProof/>
+        </w:rPr>
+        <w:drawing>
+          <wp:inline distT="0" distB="0" distL="0" distR="0" wp14:anchorId="304B0E6C" wp14:editId="2C152669">
+            <wp:extent cx="6583680" cy="3703320"/>
+            <wp:effectExtent l="0" t="0" r="7620" b="0"/>
+            <wp:docPr id="865292224" name="Picture 1"/>
+            <wp:cNvGraphicFramePr>
+              <a:graphicFrameLocks xmlns:a="http://schemas.openxmlformats.org/drawingml/2006/main" noChangeAspect="1"/>
+            </wp:cNvGraphicFramePr>
+            <a:graphic xmlns:a="http://schemas.openxmlformats.org/drawingml/2006/main">
+              <a:graphicData uri="http://schemas.openxmlformats.org/drawingml/2006/picture">
+                <pic:pic xmlns:pic="http://schemas.openxmlformats.org/drawingml/2006/picture">
+                  <pic:nvPicPr>
+                    <pic:cNvPr id="0" name="Picture 1"/>
+                    <pic:cNvPicPr>
+                      <a:picLocks noChangeAspect="1" noChangeArrowheads="1"/>
+                    </pic:cNvPicPr>
+                  </pic:nvPicPr>
+                  <pic:blipFill>
+                    <a:blip r:embed="rId12">
+                      <a:extLst>
+                        <a:ext uri="{28A0092B-C50C-407E-A947-70E740481C1C}">
+                          <a14:useLocalDpi xmlns:a14="http://schemas.microsoft.com/office/drawing/2010/main" val="0"/>
+                        </a:ext>
+                      </a:extLst>
+                    </a:blip>
+                    <a:srcRect/>
+                    <a:stretch>
+                      <a:fillRect/>
+                    </a:stretch>
+                  </pic:blipFill>
+                  <pic:spPr bwMode="auto">
+                    <a:xfrm>
+                      <a:off x="0" y="0"/>
+                      <a:ext cx="6583680" cy="3703320"/>
+                    </a:xfrm>
+                    <a:prstGeom prst="rect">
+                      <a:avLst/>
+                    </a:prstGeom>
+                    <a:noFill/>
+                    <a:ln>
+                      <a:noFill/>
+                    </a:ln>
+                  </pic:spPr>
+                </pic:pic>
+              </a:graphicData>
+            </a:graphic>
+          </wp:inline>
+        </w:drawing>
+      </w:r>
+    </w:p>
+    <w:p>
+      <w:pPr>
+        <w:rPr>
+          <w:rFonts w:ascii="Times New Roman" w:hAnsi="Times New Roman" w:cs="Times New Roman"/>
+          <w:lang w:val="en-IN"/>
+        </w:rPr>
+      </w:pPr>
+      <w:r>
+        <w:rPr>
+          <w:rFonts w:ascii="Times New Roman" w:hAnsi="Times New Roman" w:cs="Times New Roman"/>
+          <w:lang w:val="en-IN"/>
+        </w:rPr>
+        <w:t>.</w:t>
+      </w:r>
+    </w:p>
+    <w:p>
+      <w:pPr>
+        <w:jc w:val="center"/>
+        <w:rPr>
+          <w:rFonts w:ascii="Times New Roman" w:hAnsi="Times New Roman" w:cs="Times New Roman"/>
+        </w:rPr>
+      </w:pPr>
     </w:p>
     <w:sectPr>
       <w:pgSz w:w="12240" w:h="15840"/>

</xml_diff>